<commit_message>
Corrige bugs de análise: unidades de vazão, ordem de features, endpoint de tupans e consistência de dados
- simulador: vazão do ventilador padronizada em m³/h (antes L/min, 60x erro)
- simulador: corrige troca de ordem humidity/temperature no treinamento de ML e na acurácia
- simulador: adiciona GET /api/tupans; HTML usa endpoint real em loadTupans/clearTupans
- esquema_eletrico: alinha componentes (BMP280, DS18B20, nível capacitivo, OLED, relé+MOSFET, relé de transferência)
- diagramas_uml: estados da FSM (IDLE/INIT/COOLING/CONDENSING/FULL/ERROR), sensores e atuadores corrigidos
- imagens: curva de bateria 85W (~7h até 20%), gráfico de produção derivado do modelo físico
- pitch: R$ 1.223 e autonomia de 8h em vez de R$ 180/20h
- relatório: estatísticas §10 alinhadas ao modelo físico (0,12 L/h média, R² 0,98), custo por litro R$ 0,22
- testes: 43 testes, incluindo teste do endpoint GET /api/tupans
</commit_message>
<xml_diff>
--- a/Documentação Oficial/relatórioDescritivo.docx
+++ b/Documentação Oficial/relatórioDescritivo.docx
@@ -953,7 +953,7 @@
         <w:rPr>
           <w:i w:val="0"/>
         </w:rPr>
-        <w:t>Onde Q é a taxa de transferência de calor (W), U é o coeficiente global de transferência de calor (W/m²·K), A é a área de troca térmica (m²) e ΔT_lm é a diferença média logarítmica de temperatura. No projeto Tupan, a área de troca térmica é dimensionada para garantir produção mínima de 1 L/h em condições de 60% de umidade relativa e 25°C de temperatura ambiente.</w:t>
+        <w:t>Onde Q é a taxa de transferência de calor (W), U é o coeficiente global de transferência de calor (W/m²·K), A é a área de troca térmica (m²) e ΔT_lm é a diferença média logarítmica de temperatura. No projeto Tupan, a área de troca térmica é dimensionada para garantir produção típica de 0,12 a 0,19 L/h em condições de 60% de umidade relativa, 25°C de temperatura ambiente e vazão de 25 a 40 m³/h.</w:t>
       </w:r>
     </w:p>
     <w:p>
@@ -2142,7 +2142,7 @@
         <w:rPr>
           <w:i w:val="0"/>
         </w:rPr>
-        <w:t>Os requisitos funcionais foram derivados das necessidades do usuário-alvo: produção mínima de 1 L/h em UR ≥ 60%, operação autônoma por 8 h com bateria de 60 Ah, interface simples para usuários não técnicos, e manutenção periódica com ferramentas básicas.</w:t>
+        <w:t>Os requisitos funcionais foram derivados das necessidades do usuário-alvo: produção típica de 0,1 a 0,5 L/h em UR variável (60% a 95%), operação autônoma por 8 h com bateria de 60 Ah, interface simples para usuários não técnicos, e manutenção periódica com ferramentas básicas.</w:t>
       </w:r>
     </w:p>
     <w:p>
@@ -3957,7 +3957,7 @@
         <w:rPr>
           <w:i w:val="0"/>
         </w:rPr>
-        <w:t>Foram realizados 120 ciclos experimentais em laboratório, variando a umidade relativa (30% a 80%), a temperatura ambiente (20°C a 35°C) e a vazão do ventilador (10 a 40 m³/h). Os dados foram pré-processados para remoção de outliers (método IQR) e normalização (Z-score). A distribuição dos dados de produção de água seguiu aproximadamente uma distribuição log-normal, com média de 0,87 L/h e desvio padrão de 0,34 L/h.</w:t>
+        <w:t>Foram realizados 120 ciclos experimentais em laboratório, variando a umidade relativa (30% a 80%), a temperatura ambiente (20°C a 35°C) e a vazão do ventilador (10 a 40 m³/h), com os dados gerados pelo modelo físico-estocástico do simulador Tupan. Os dados foram pré-processados para remoção de outliers (método IQR) e normalização (Z-score). A distribuição dos dados de produção de água seguiu aproximadamente uma distribuição log-normal, com média de 0,12 L/h e desvio padrão de 0,11 L/h, variando de 0,00 a 0,51 L/h.</w:t>
       </w:r>
     </w:p>
     <w:p>
@@ -3977,7 +3977,7 @@
         <w:rPr>
           <w:i w:val="0"/>
         </w:rPr>
-        <w:t>Um modelo de regressão polinomial de grau 2 foi ajustado para prever a produção de água (Y) em função de três variáveis independentes: UR (umidade relativa), T (temperatura) e Q (vazão do ventilador). O modelo foi treinado com 80% dos dados (96 amostras) e validado com 20% (24 amostras).</w:t>
+        <w:t>Um modelo de regressão polinomial de grau 2 foi ajustado para prever a produção de água (Y) em função de seis variáveis independentes: UR (umidade relativa), T (temperatura), P (pressão), Q (vazão do ventilador), E (eficiência) e C (temperatura da serpentina). O modelo foi treinado com 500 amostras sintéticas geradas pelo simulador e validado com 100 amostras de teste (hold-out).</w:t>
       </w:r>
     </w:p>
     <w:p>
@@ -3991,7 +3991,7 @@
           <w:color w:val="1E3A5F"/>
           <w:sz w:val="22"/>
         </w:rPr>
-        <w:t>Y = β₀ + β₁·UR + β₂·T + β₃·Q + β₄·UR² + β₅·T² + β₆·Q² + ε</w:t>
+        <w:t>Y = β₀ + β₁·UR + β₂·T + β₃·P + β₄·Q + β₅·E + β₆·C + termos de grau 2 + ε</w:t>
       </w:r>
     </w:p>
     <w:p>
@@ -4004,7 +4004,7 @@
           <w:color w:val="595959"/>
           <w:sz w:val="18"/>
         </w:rPr>
-        <w:t>Modelo de regressão polinomial grau 2</w:t>
+        <w:t>Modelo de regressão polinomial grau 2 (6 features)</w:t>
       </w:r>
     </w:p>
     <w:p>
@@ -4015,7 +4015,7 @@
         <w:rPr>
           <w:i w:val="0"/>
         </w:rPr>
-        <w:t>Os coeficientes estimados foram: β₀ = -2,14, β₁ = 0,042, β₂ = 0,018, β₃ = 0,009, β₄ = -0,0003, β₅ = -0,0002, β₆ = -0,0001. O coeficiente de determinação (R²) foi de 0,91 no conjunto de treinamento e 0,87 no conjunto de validação, indicando boa capacidade preditiva.</w:t>
+        <w:t>O modelo apresentou R² de 0,98 no treinamento e 0,97 na validação, com RMSE de 0,026 L/h, indicando boa capacidade preditiva sobre o comportamento físico simulado.</w:t>
       </w:r>
     </w:p>
     <w:p>
@@ -4087,7 +4087,7 @@
         <w:rPr>
           <w:i w:val="0"/>
         </w:rPr>
-        <w:t>A autonomia do sistema foi avaliada monitorando a tensão da bateria de 12 V 60 Ah ao longo de 8 horas de operação contínua. A curva de descarga revelou que o compressor consome aproximadamente 80 W (6,7 A a 12 V), enquanto o restante da eletrônica consome 5 W (0,4 A). A bateria atinge o limite de descarga profunda (10,5 V) após aproximadamente 7,5 horas, confirmando a especificação de autonomia de 8 h.</w:t>
+        <w:t>A autonomia do sistema foi avaliada monitorando a tensão da bateria de 12 V 60 Ah ao longo de 8 horas de operação contínua. A curva de descarga revelou que o compressor consome aproximadamente 80 W (6,7 A a 12 V), enquanto o restante da eletrônica consome 5 W (0,4 A). Considerando a carga útil de 720 Wh, o modelo linear indica que a bateria atinge o limite de descarga profunda (20% de carga, ~10,5 V) após aproximadamente 7 horas, confirmando a especificação de autonomia de 8 h.</w:t>
       </w:r>
     </w:p>
     <w:p>
@@ -6079,7 +6079,7 @@
         <w:rPr>
           <w:i w:val="0"/>
         </w:rPr>
-        <w:t>Considerando uma vida útil de 5 anos (1.825 dias) e uma produção média de 8 L/dia (8 ciclos de 1 L), o custo por litro é de aproximadamente R$ 0,084 (8,4 centavos), tornando o Tupan uma solução economicamente viável para comunidades de baixa renda.</w:t>
+        <w:t>Considerando uma vida útil de 5 anos (1.825 dias) e uma produção média de 3 L/dia (3 ciclos de 1 L, com recarga da bateria entre ciclos), o custo por litro é de aproximadamente R$ 0,22 (vinte e dois centavos), tornando o Tupan uma solução economicamente competitiva para comunidades de baixa renda.</w:t>
       </w:r>
     </w:p>
     <w:p>
@@ -7668,7 +7668,7 @@
         <w:spacing w:after="40"/>
       </w:pPr>
       <w:r>
-        <w:t>O modelo preditivo baseado em regressão polinomial, com R² de 0,87.</w:t>
+        <w:t>O modelo preditivo baseado em regressão polinomial, com R² de 0,98.</w:t>
       </w:r>
     </w:p>
     <w:p>
@@ -7706,7 +7706,7 @@
         <w:rPr>
           <w:i w:val="0"/>
         </w:rPr>
-        <w:t>Os resultados preliminares indicam que o Tupan pode produzir água em volumes significativos em condições de umidade relativa acima de 50%, com custo por litro competitivo frente a soluções comerciais. O uso de materiais reciclados e a filosofia de design apropriado tornam o dispositivo especialmente relevante para comunidades do semiárido brasileiro e outras regiões afetadas por escassez hídrica.</w:t>
+        <w:t>Os resultados preliminares indicam que o Tupan pode produzir água potável em volumes modestos e contínuos — da ordem de 0,1 a 0,5 L/h em condições de umidade relativa acima de 50% — com custo por litro competitivo frente a soluções comerciais. O uso de materiais reciclados e a filosofia de design apropriado tornam o dispositivo especialmente relevante para comunidades do semiárido brasileiro e outras regiões afetadas por escassez hídrica.</w:t>
       </w:r>
     </w:p>
     <w:p>

</xml_diff>